<commit_message>
Add beauty appointments, shopping and fan stops
</commit_message>
<xml_diff>
--- a/seoul_gangnam_2_night_itinerary.docx
+++ b/seoul_gangnam_2_night_itinerary.docx
@@ -27,7 +27,7 @@
           <w:color w:val="6E6A61"/>
           <w:sz w:val="22"/>
         </w:rPr>
-        <w:t>两晚首尔路线：购物、剪发化妆、写真拍摄与手术恢复</w:t>
+        <w:t>两晚首尔路线：落地剪发、妆造证件照、购物与皮肤管理</w:t>
       </w:r>
     </w:p>
     <w:tbl>
@@ -62,7 +62,7 @@
                 <w:color w:val="171714"/>
                 <w:sz w:val="22"/>
               </w:rPr>
-              <w:t>最佳路线：第 1 天逛江南站门店；第 2 天在狎鸥亭完成造型、写真和奢侈品购物；手术后不安排购物。</w:t>
+              <w:t>最佳路线：第 1 天落地后先去明洞剪发，再入住江南；第 2 天完成 JOY187 妆造和 시현하다 证件照；第 3 天做皮肤管理并去 T1 粉丝店。</w:t>
             </w:r>
           </w:p>
         </w:tc>
@@ -82,7 +82,7 @@
         <w:spacing w:after="80"/>
       </w:pPr>
       <w:r>
-        <w:t>请用准确地址替换 Airbnb、发廊、化妆室、摄影棚和医院的临时位置。</w:t>
+        <w:t>请用准确地址替换地图中的江南酒店临时位置。</w:t>
       </w:r>
     </w:p>
     <w:p>
@@ -91,7 +91,7 @@
         <w:spacing w:after="80"/>
       </w:pPr>
       <w:r>
-        <w:t>直接向医院确认禁食、药物、陪同、留院和术后搭乘飞机的限制。</w:t>
+        <w:t>尽快预约 Parisien Hair、JOY187 和 시현하다，并将航班落地时间与证件照用途告知店家。</w:t>
       </w:r>
     </w:p>
     <w:p>
@@ -100,7 +100,7 @@
         <w:spacing w:after="80"/>
       </w:pPr>
       <w:r>
-        <w:t>如果是较大的手术，两晚可能在医学上并不足够；医院要求优先于本行程。</w:t>
+        <w:t>向林克医院确认具体皮肤管理项目、术后护肤、化妆及出行限制。</w:t>
       </w:r>
     </w:p>
     <w:p>
@@ -116,7 +116,7 @@
         <w:pStyle w:val="Heading2"/>
       </w:pPr>
       <w:r>
-        <w:t>第 1 天: 抵达 + 江南购物</w:t>
+        <w:t>第 1 天: 抵达、剪发 + 江南大路购物</w:t>
       </w:r>
     </w:p>
     <w:tbl>
@@ -227,7 +227,7 @@
                 <w:color w:val="171714"/>
                 <w:sz w:val="18"/>
               </w:rPr>
-              <w:t>15:00</w:t>
+              <w:t>抵达后</w:t>
             </w:r>
           </w:p>
         </w:tc>
@@ -253,9 +253,9 @@
                 <w:color w:val="171714"/>
                 <w:sz w:val="18"/>
               </w:rPr>
-              <w:t>入住并休息</w:t>
+              <w:t>机场前往 Parisien Hair</w:t>
               <w:br/>
-              <w:t>Airbnb</w:t>
+              <w:t>明洞</w:t>
             </w:r>
           </w:p>
         </w:tc>
@@ -281,7 +281,7 @@
                 <w:color w:val="171714"/>
                 <w:sz w:val="18"/>
               </w:rPr>
-              <w:t>为机场到江南的交通及安放行李预留时间。</w:t>
+              <w:t>入境和取行李后前往明洞。只有航班能在预约前留下至少 2.5-3 小时缓冲时才锁定当天剪发。</w:t>
             </w:r>
           </w:p>
         </w:tc>
@@ -309,7 +309,7 @@
                 <w:color w:val="171714"/>
                 <w:sz w:val="18"/>
               </w:rPr>
-              <w:t>17:00</w:t>
+              <w:t>预约时间</w:t>
             </w:r>
           </w:p>
         </w:tc>
@@ -335,9 +335,9 @@
                 <w:color w:val="171714"/>
                 <w:sz w:val="18"/>
               </w:rPr>
-              <w:t>adidas Gangnam Brand Center</w:t>
+              <w:t>Parisien Hair 剪发</w:t>
               <w:br/>
-              <w:t>adidas</w:t>
+              <w:t>明洞</w:t>
             </w:r>
           </w:p>
         </w:tc>
@@ -363,7 +363,7 @@
                 <w:color w:val="171714"/>
                 <w:sz w:val="18"/>
               </w:rPr>
-              <w:t>从江南站步行、搭地铁或短程出租车前往。</w:t>
+              <w:t>预留 90-120 分钟。只剪发或简单造型最稳妥，不建议抵达日安排耗时烫染。</w:t>
             </w:r>
           </w:p>
         </w:tc>
@@ -391,7 +391,7 @@
                 <w:color w:val="171714"/>
                 <w:sz w:val="18"/>
               </w:rPr>
-              <w:t>18:30</w:t>
+              <w:t>之后</w:t>
             </w:r>
           </w:p>
         </w:tc>
@@ -417,9 +417,9 @@
                 <w:color w:val="171714"/>
                 <w:sz w:val="18"/>
               </w:rPr>
-              <w:t>Olive Young Gangnam Town</w:t>
+              <w:t>前往江南酒店并入住</w:t>
               <w:br/>
-              <w:t>Olive Young</w:t>
+              <w:t>江南</w:t>
             </w:r>
           </w:p>
         </w:tc>
@@ -445,7 +445,7 @@
                 <w:color w:val="171714"/>
                 <w:sz w:val="18"/>
               </w:rPr>
-              <w:t>安排在 adidas 之后；营业较晚，并可办理退税。</w:t>
+              <w:t>明洞到江南带行李建议出租车；晚高峰需预留 45-70 分钟。</w:t>
             </w:r>
           </w:p>
         </w:tc>
@@ -473,7 +473,171 @@
                 <w:color w:val="171714"/>
                 <w:sz w:val="18"/>
               </w:rPr>
-              <w:t>20:15</w:t>
+              <w:t>傍晚</w:t>
+            </w:r>
+          </w:p>
+        </w:tc>
+        <w:tc>
+          <w:tcPr>
+            <w:tcW w:type="dxa" w:w="3096"/>
+            <w:vAlign w:val="center"/>
+            <w:tcMar>
+              <w:top w:w="100" w:type="dxa"/>
+              <w:start w:w="120" w:type="dxa"/>
+              <w:bottom w:w="100" w:type="dxa"/>
+              <w:end w:w="120" w:type="dxa"/>
+            </w:tcMar>
+          </w:tcPr>
+          <w:p>
+            <w:pPr>
+              <w:spacing w:after="0"/>
+            </w:pPr>
+            <w:r>
+              <w:rPr>
+                <w:rFonts w:ascii="Arial" w:hAnsi="Arial"/>
+                <w:b w:val="0"/>
+                <w:color w:val="171714"/>
+                <w:sz w:val="18"/>
+              </w:rPr>
+              <w:t>lululemon → adidas</w:t>
+              <w:br/>
+              <w:t>江南大路</w:t>
+            </w:r>
+          </w:p>
+        </w:tc>
+        <w:tc>
+          <w:tcPr>
+            <w:tcW w:type="dxa" w:w="5544"/>
+            <w:vAlign w:val="center"/>
+            <w:tcMar>
+              <w:top w:w="100" w:type="dxa"/>
+              <w:start w:w="120" w:type="dxa"/>
+              <w:bottom w:w="100" w:type="dxa"/>
+              <w:end w:w="120" w:type="dxa"/>
+            </w:tcMar>
+          </w:tcPr>
+          <w:p>
+            <w:pPr>
+              <w:spacing w:after="0"/>
+            </w:pPr>
+            <w:r>
+              <w:rPr>
+                <w:rFonts w:ascii="Arial" w:hAnsi="Arial"/>
+                <w:b w:val="0"/>
+                <w:color w:val="171714"/>
+                <w:sz w:val="18"/>
+              </w:rPr>
+              <w:t>两店门牌分别为 458 和 470，步行即可完成。</w:t>
+            </w:r>
+          </w:p>
+        </w:tc>
+      </w:tr>
+      <w:tr>
+        <w:tc>
+          <w:tcPr>
+            <w:tcW w:type="dxa" w:w="1181"/>
+            <w:vAlign w:val="center"/>
+            <w:tcMar>
+              <w:top w:w="100" w:type="dxa"/>
+              <w:start w:w="120" w:type="dxa"/>
+              <w:bottom w:w="100" w:type="dxa"/>
+              <w:end w:w="120" w:type="dxa"/>
+            </w:tcMar>
+          </w:tcPr>
+          <w:p>
+            <w:pPr>
+              <w:spacing w:after="0"/>
+            </w:pPr>
+            <w:r>
+              <w:rPr>
+                <w:rFonts w:ascii="Arial" w:hAnsi="Arial"/>
+                <w:b/>
+                <w:color w:val="171714"/>
+                <w:sz w:val="18"/>
+              </w:rPr>
+              <w:t>晚上</w:t>
+            </w:r>
+          </w:p>
+        </w:tc>
+        <w:tc>
+          <w:tcPr>
+            <w:tcW w:type="dxa" w:w="3096"/>
+            <w:vAlign w:val="center"/>
+            <w:tcMar>
+              <w:top w:w="100" w:type="dxa"/>
+              <w:start w:w="120" w:type="dxa"/>
+              <w:bottom w:w="100" w:type="dxa"/>
+              <w:end w:w="120" w:type="dxa"/>
+            </w:tcMar>
+          </w:tcPr>
+          <w:p>
+            <w:pPr>
+              <w:spacing w:after="0"/>
+            </w:pPr>
+            <w:r>
+              <w:rPr>
+                <w:rFonts w:ascii="Arial" w:hAnsi="Arial"/>
+                <w:b w:val="0"/>
+                <w:color w:val="171714"/>
+                <w:sz w:val="18"/>
+              </w:rPr>
+              <w:t>OLENS → Olive Young</w:t>
+              <w:br/>
+              <w:t>江南站</w:t>
+            </w:r>
+          </w:p>
+        </w:tc>
+        <w:tc>
+          <w:tcPr>
+            <w:tcW w:type="dxa" w:w="5544"/>
+            <w:vAlign w:val="center"/>
+            <w:tcMar>
+              <w:top w:w="100" w:type="dxa"/>
+              <w:start w:w="120" w:type="dxa"/>
+              <w:bottom w:w="100" w:type="dxa"/>
+              <w:end w:w="120" w:type="dxa"/>
+            </w:tcMar>
+          </w:tcPr>
+          <w:p>
+            <w:pPr>
+              <w:spacing w:after="0"/>
+            </w:pPr>
+            <w:r>
+              <w:rPr>
+                <w:rFonts w:ascii="Arial" w:hAnsi="Arial"/>
+                <w:b w:val="0"/>
+                <w:color w:val="171714"/>
+                <w:sz w:val="18"/>
+              </w:rPr>
+              <w:t>OLENS 428 与 Olive Young 429 相邻，最后统一购买美瞳和护肤品并办理退税。</w:t>
+            </w:r>
+          </w:p>
+        </w:tc>
+      </w:tr>
+      <w:tr>
+        <w:tc>
+          <w:tcPr>
+            <w:tcW w:type="dxa" w:w="1181"/>
+            <w:vAlign w:val="center"/>
+            <w:tcMar>
+              <w:top w:w="100" w:type="dxa"/>
+              <w:start w:w="120" w:type="dxa"/>
+              <w:bottom w:w="100" w:type="dxa"/>
+              <w:end w:w="120" w:type="dxa"/>
+            </w:tcMar>
+          </w:tcPr>
+          <w:p>
+            <w:pPr>
+              <w:spacing w:after="0"/>
+            </w:pPr>
+            <w:r>
+              <w:rPr>
+                <w:rFonts w:ascii="Arial" w:hAnsi="Arial"/>
+                <w:b/>
+                <w:color w:val="171714"/>
+                <w:sz w:val="18"/>
+              </w:rPr>
+              <w:t>20:30</w:t>
             </w:r>
           </w:p>
         </w:tc>
@@ -527,7 +691,7 @@
                 <w:color w:val="171714"/>
                 <w:sz w:val="18"/>
               </w:rPr>
-              <w:t>第一晚保持轻松，尽量不要离 Airbnb 太远。</w:t>
+              <w:t>如果航班晚点，购物顺延到第三天下午，不要压缩剪发时间。</w:t>
             </w:r>
           </w:p>
         </w:tc>
@@ -543,7 +707,7 @@
         <w:pStyle w:val="Heading2"/>
       </w:pPr>
       <w:r>
-        <w:t>第 2 天: 造型、拍摄 + 狎鸥亭购物</w:t>
+        <w:t>第 2 天: JOY187 妆造、证件照 + 狎鸥亭购物</w:t>
       </w:r>
     </w:p>
     <w:tbl>
@@ -654,7 +818,7 @@
                 <w:color w:val="171714"/>
                 <w:sz w:val="18"/>
               </w:rPr>
-              <w:t>08:00</w:t>
+              <w:t>09:00</w:t>
             </w:r>
           </w:p>
         </w:tc>
@@ -680,9 +844,9 @@
                 <w:color w:val="171714"/>
                 <w:sz w:val="18"/>
               </w:rPr>
-              <w:t>剪发与造型</w:t>
+              <w:t>JOY187 妆发造型</w:t>
               <w:br/>
-              <w:t>发廊</w:t>
+              <w:t>清潭洞</w:t>
             </w:r>
           </w:p>
         </w:tc>
@@ -708,7 +872,7 @@
                 <w:color w:val="171714"/>
                 <w:sz w:val="18"/>
               </w:rPr>
-              <w:t>包括沟通和完成造型，预留 90 分钟。</w:t>
+              <w:t>建议预留 2-2.5 小时；提前发送证件照参考和服装领口照片。</w:t>
             </w:r>
           </w:p>
         </w:tc>
@@ -736,7 +900,7 @@
                 <w:color w:val="171714"/>
                 <w:sz w:val="18"/>
               </w:rPr>
-              <w:t>09:30</w:t>
+              <w:t>11:15</w:t>
             </w:r>
           </w:p>
         </w:tc>
@@ -762,9 +926,9 @@
                 <w:color w:val="171714"/>
                 <w:sz w:val="18"/>
               </w:rPr>
-              <w:t>化妆</w:t>
+              <w:t>前往 시현하다</w:t>
               <w:br/>
-              <w:t>化妆室</w:t>
+              <w:t>清潭 → 驿三</w:t>
             </w:r>
           </w:p>
         </w:tc>
@@ -790,7 +954,7 @@
                 <w:color w:val="171714"/>
                 <w:sz w:val="18"/>
               </w:rPr>
-              <w:t>预留 75-90 分钟，并带上妆容参考照片。</w:t>
+              <w:t>出租车约 25-40 分钟，堵车时更久；至少留 30 分钟缓冲。</w:t>
             </w:r>
           </w:p>
         </w:tc>
@@ -818,7 +982,7 @@
                 <w:color w:val="171714"/>
                 <w:sz w:val="18"/>
               </w:rPr>
-              <w:t>11:00</w:t>
+              <w:t>12:00</w:t>
             </w:r>
           </w:p>
         </w:tc>
@@ -844,9 +1008,9 @@
                 <w:color w:val="171714"/>
                 <w:sz w:val="18"/>
               </w:rPr>
-              <w:t>交通与补妆缓冲</w:t>
+              <w:t>시현하다 证件照</w:t>
               <w:br/>
-              <w:t>狎鸥亭</w:t>
+              <w:t>Gangnam Original</w:t>
             </w:r>
           </w:p>
         </w:tc>
@@ -872,89 +1036,7 @@
                 <w:color w:val="171714"/>
                 <w:sz w:val="18"/>
               </w:rPr>
-              <w:t>预留 30 分钟应对延误、换装和最后补妆。</w:t>
-            </w:r>
-          </w:p>
-        </w:tc>
-      </w:tr>
-      <w:tr>
-        <w:tc>
-          <w:tcPr>
-            <w:tcW w:type="dxa" w:w="1181"/>
-            <w:vAlign w:val="center"/>
-            <w:tcMar>
-              <w:top w:w="100" w:type="dxa"/>
-              <w:start w:w="120" w:type="dxa"/>
-              <w:bottom w:w="100" w:type="dxa"/>
-              <w:end w:w="120" w:type="dxa"/>
-            </w:tcMar>
-          </w:tcPr>
-          <w:p>
-            <w:pPr>
-              <w:spacing w:after="0"/>
-            </w:pPr>
-            <w:r>
-              <w:rPr>
-                <w:rFonts w:ascii="Arial" w:hAnsi="Arial"/>
-                <w:b/>
-                <w:color w:val="171714"/>
-                <w:sz w:val="18"/>
-              </w:rPr>
-              <w:t>11:30</w:t>
-            </w:r>
-          </w:p>
-        </w:tc>
-        <w:tc>
-          <w:tcPr>
-            <w:tcW w:type="dxa" w:w="3096"/>
-            <w:vAlign w:val="center"/>
-            <w:tcMar>
-              <w:top w:w="100" w:type="dxa"/>
-              <w:start w:w="120" w:type="dxa"/>
-              <w:bottom w:w="100" w:type="dxa"/>
-              <w:end w:w="120" w:type="dxa"/>
-            </w:tcMar>
-          </w:tcPr>
-          <w:p>
-            <w:pPr>
-              <w:spacing w:after="0"/>
-            </w:pPr>
-            <w:r>
-              <w:rPr>
-                <w:rFonts w:ascii="Arial" w:hAnsi="Arial"/>
-                <w:b w:val="0"/>
-                <w:color w:val="171714"/>
-                <w:sz w:val="18"/>
-              </w:rPr>
-              <w:t>写真拍摄</w:t>
-              <w:br/>
-              <w:t>摄影棚</w:t>
-            </w:r>
-          </w:p>
-        </w:tc>
-        <w:tc>
-          <w:tcPr>
-            <w:tcW w:type="dxa" w:w="5544"/>
-            <w:vAlign w:val="center"/>
-            <w:tcMar>
-              <w:top w:w="100" w:type="dxa"/>
-              <w:start w:w="120" w:type="dxa"/>
-              <w:bottom w:w="100" w:type="dxa"/>
-              <w:end w:w="120" w:type="dxa"/>
-            </w:tcMar>
-          </w:tcPr>
-          <w:p>
-            <w:pPr>
-              <w:spacing w:after="0"/>
-            </w:pPr>
-            <w:r>
-              <w:rPr>
-                <w:rFonts w:ascii="Arial" w:hAnsi="Arial"/>
-                <w:b w:val="0"/>
-                <w:color w:val="171714"/>
-                <w:sz w:val="18"/>
-              </w:rPr>
-              <w:t>时间可编辑；建议预留约两小时，并在皮肤管理前完成，以免泛红影响上镜。</w:t>
+              <w:t>预约 60-90 分钟。若用于护照，须白底、不可戴有色美瞳，并减少过度修图。</w:t>
             </w:r>
           </w:p>
         </w:tc>
@@ -1008,7 +1090,7 @@
                 <w:color w:val="171714"/>
                 <w:sz w:val="18"/>
               </w:rPr>
-              <w:t>午餐及缓冲</w:t>
+              <w:t>午餐并返回狎鸥亭</w:t>
               <w:br/>
               <w:t>狎鸥亭</w:t>
             </w:r>
@@ -1036,7 +1118,7 @@
                 <w:color w:val="171714"/>
                 <w:sz w:val="18"/>
               </w:rPr>
-              <w:t>不要让购物行程紧接着拍摄结束时间。</w:t>
+              <w:t>午餐后开始同区域购物，避免反复跨区。</w:t>
             </w:r>
           </w:p>
         </w:tc>
@@ -1090,9 +1172,9 @@
                 <w:color w:val="171714"/>
                 <w:sz w:val="18"/>
               </w:rPr>
-              <w:t>CASA LOEWE Seoul</w:t>
+              <w:t>Gentle Monster HAUS DOSAN</w:t>
               <w:br/>
-              <w:t>LOEWE</w:t>
+              <w:t>岛山公园</w:t>
             </w:r>
           </w:p>
         </w:tc>
@@ -1118,7 +1200,7 @@
                 <w:color w:val="171714"/>
                 <w:sz w:val="18"/>
               </w:rPr>
-              <w:t>旗舰店建议预留约 60 分钟。</w:t>
+              <w:t>建议 45-60 分钟，热门时段可能排队。</w:t>
             </w:r>
           </w:p>
         </w:tc>
@@ -1146,7 +1228,7 @@
                 <w:color w:val="171714"/>
                 <w:sz w:val="18"/>
               </w:rPr>
-              <w:t>15:45</w:t>
+              <w:t>15:40</w:t>
             </w:r>
           </w:p>
         </w:tc>
@@ -1172,9 +1254,9 @@
                 <w:color w:val="171714"/>
                 <w:sz w:val="18"/>
               </w:rPr>
-              <w:t>Galleria WEST Vivienne Westwood</w:t>
+              <w:t>CASA LOEWE → Vivienne Westwood</w:t>
               <w:br/>
-              <w:t>Vivienne Westwood</w:t>
+              <w:t>狎鸥亭</w:t>
             </w:r>
           </w:p>
         </w:tc>
@@ -1200,7 +1282,7 @@
                 <w:color w:val="171714"/>
                 <w:sz w:val="18"/>
               </w:rPr>
-              <w:t>距离 CASA LOEWE 约 10-15 分钟出租车程，也可步行。</w:t>
+              <w:t>先 LOEWE，再到 Galleria WEST 3F；两站可步行或短程出租车。</w:t>
             </w:r>
           </w:p>
         </w:tc>
@@ -1228,7 +1310,7 @@
                 <w:color w:val="171714"/>
                 <w:sz w:val="18"/>
               </w:rPr>
-              <w:t>17:15</w:t>
+              <w:t>17:30</w:t>
             </w:r>
           </w:p>
         </w:tc>
@@ -1254,9 +1336,9 @@
                 <w:color w:val="171714"/>
                 <w:sz w:val="18"/>
               </w:rPr>
-              <w:t>咖啡 / 返回 Airbnb</w:t>
+              <w:t>lululemon Cheongdam / Le Labo</w:t>
               <w:br/>
-              <w:t>休息缓冲</w:t>
+              <w:t>二选一或都去</w:t>
             </w:r>
           </w:p>
         </w:tc>
@@ -1282,7 +1364,89 @@
                 <w:color w:val="171714"/>
                 <w:sz w:val="18"/>
               </w:rPr>
-              <w:t>晚间保持空闲，以便遵守医院的术前要求。</w:t>
+              <w:t>体力好可去清潭 lululemon；想买香水则去新沙 Le Labo。两者方向不同，不要勉强全塞。</w:t>
+            </w:r>
+          </w:p>
+        </w:tc>
+      </w:tr>
+      <w:tr>
+        <w:tc>
+          <w:tcPr>
+            <w:tcW w:type="dxa" w:w="1181"/>
+            <w:vAlign w:val="center"/>
+            <w:tcMar>
+              <w:top w:w="100" w:type="dxa"/>
+              <w:start w:w="120" w:type="dxa"/>
+              <w:bottom w:w="100" w:type="dxa"/>
+              <w:end w:w="120" w:type="dxa"/>
+            </w:tcMar>
+          </w:tcPr>
+          <w:p>
+            <w:pPr>
+              <w:spacing w:after="0"/>
+            </w:pPr>
+            <w:r>
+              <w:rPr>
+                <w:rFonts w:ascii="Arial" w:hAnsi="Arial"/>
+                <w:b/>
+                <w:color w:val="171714"/>
+                <w:sz w:val="18"/>
+              </w:rPr>
+              <w:t>19:00</w:t>
+            </w:r>
+          </w:p>
+        </w:tc>
+        <w:tc>
+          <w:tcPr>
+            <w:tcW w:type="dxa" w:w="3096"/>
+            <w:vAlign w:val="center"/>
+            <w:tcMar>
+              <w:top w:w="100" w:type="dxa"/>
+              <w:start w:w="120" w:type="dxa"/>
+              <w:bottom w:w="100" w:type="dxa"/>
+              <w:end w:w="120" w:type="dxa"/>
+            </w:tcMar>
+          </w:tcPr>
+          <w:p>
+            <w:pPr>
+              <w:spacing w:after="0"/>
+            </w:pPr>
+            <w:r>
+              <w:rPr>
+                <w:rFonts w:ascii="Arial" w:hAnsi="Arial"/>
+                <w:b w:val="0"/>
+                <w:color w:val="171714"/>
+                <w:sz w:val="18"/>
+              </w:rPr>
+              <w:t>返回江南酒店</w:t>
+              <w:br/>
+              <w:t>江南</w:t>
+            </w:r>
+          </w:p>
+        </w:tc>
+        <w:tc>
+          <w:tcPr>
+            <w:tcW w:type="dxa" w:w="5544"/>
+            <w:vAlign w:val="center"/>
+            <w:tcMar>
+              <w:top w:w="100" w:type="dxa"/>
+              <w:start w:w="120" w:type="dxa"/>
+              <w:bottom w:w="100" w:type="dxa"/>
+              <w:end w:w="120" w:type="dxa"/>
+            </w:tcMar>
+          </w:tcPr>
+          <w:p>
+            <w:pPr>
+              <w:spacing w:after="0"/>
+            </w:pPr>
+            <w:r>
+              <w:rPr>
+                <w:rFonts w:ascii="Arial" w:hAnsi="Arial"/>
+                <w:b w:val="0"/>
+                <w:color w:val="171714"/>
+                <w:sz w:val="18"/>
+              </w:rPr>
+              <w:t>保留卸妆、休息和第二天皮肤管理前的护肤缓冲。</w:t>
             </w:r>
           </w:p>
         </w:tc>
@@ -1599,9 +1763,9 @@
                 <w:color w:val="171714"/>
                 <w:sz w:val="18"/>
               </w:rPr>
-              <w:t>午餐并返回江南酒店</w:t>
+              <w:t>T1 HQ Shop</w:t>
               <w:br/>
-              <w:t>江南</w:t>
+              <w:t>论岘 / 宣靖陵</w:t>
             </w:r>
           </w:p>
         </w:tc>
@@ -1627,7 +1791,7 @@
                 <w:color w:val="171714"/>
                 <w:sz w:val="18"/>
               </w:rPr>
-              <w:t>治疗后保持轻松，避免安排需要长时间暴晒的户外活动。</w:t>
+              <w:t>店铺约 12:00 开门；皮肤管理后搭短程出租车，室内轻松参观约 45-60 分钟。</w:t>
             </w:r>
           </w:p>
         </w:tc>
@@ -1681,9 +1845,9 @@
                 <w:color w:val="171714"/>
                 <w:sz w:val="18"/>
               </w:rPr>
-              <w:t>休息 / 补买遗漏物品</w:t>
+              <w:t>补买遗漏物品 / 返回酒店</w:t>
               <w:br/>
-              <w:t>江南站附近</w:t>
+              <w:t>江南</w:t>
             </w:r>
           </w:p>
         </w:tc>
@@ -1710,6 +1874,88 @@
                 <w:sz w:val="18"/>
               </w:rPr>
               <w:t>若皮肤没有明显红肿，可在医生允许下进行轻松室内活动。</w:t>
+            </w:r>
+          </w:p>
+        </w:tc>
+      </w:tr>
+      <w:tr>
+        <w:tc>
+          <w:tcPr>
+            <w:tcW w:type="dxa" w:w="1181"/>
+            <w:vAlign w:val="center"/>
+            <w:tcMar>
+              <w:top w:w="100" w:type="dxa"/>
+              <w:start w:w="120" w:type="dxa"/>
+              <w:bottom w:w="100" w:type="dxa"/>
+              <w:end w:w="120" w:type="dxa"/>
+            </w:tcMar>
+          </w:tcPr>
+          <w:p>
+            <w:pPr>
+              <w:spacing w:after="0"/>
+            </w:pPr>
+            <w:r>
+              <w:rPr>
+                <w:rFonts w:ascii="Arial" w:hAnsi="Arial"/>
+                <w:b/>
+                <w:color w:val="171714"/>
+                <w:sz w:val="18"/>
+              </w:rPr>
+              <w:t>可选</w:t>
+            </w:r>
+          </w:p>
+        </w:tc>
+        <w:tc>
+          <w:tcPr>
+            <w:tcW w:type="dxa" w:w="3096"/>
+            <w:vAlign w:val="center"/>
+            <w:tcMar>
+              <w:top w:w="100" w:type="dxa"/>
+              <w:start w:w="120" w:type="dxa"/>
+              <w:bottom w:w="100" w:type="dxa"/>
+              <w:end w:w="120" w:type="dxa"/>
+            </w:tcMar>
+          </w:tcPr>
+          <w:p>
+            <w:pPr>
+              <w:spacing w:after="0"/>
+            </w:pPr>
+            <w:r>
+              <w:rPr>
+                <w:rFonts w:ascii="Arial" w:hAnsi="Arial"/>
+                <w:b w:val="0"/>
+                <w:color w:val="171714"/>
+                <w:sz w:val="18"/>
+              </w:rPr>
+              <w:t>HYBE 总部外观打卡</w:t>
+              <w:br/>
+              <w:t>龙山</w:t>
+            </w:r>
+          </w:p>
+        </w:tc>
+        <w:tc>
+          <w:tcPr>
+            <w:tcW w:type="dxa" w:w="5544"/>
+            <w:vAlign w:val="center"/>
+            <w:tcMar>
+              <w:top w:w="100" w:type="dxa"/>
+              <w:start w:w="120" w:type="dxa"/>
+              <w:bottom w:w="100" w:type="dxa"/>
+              <w:end w:w="120" w:type="dxa"/>
+            </w:tcMar>
+          </w:tcPr>
+          <w:p>
+            <w:pPr>
+              <w:spacing w:after="0"/>
+            </w:pPr>
+            <w:r>
+              <w:rPr>
+                <w:rFonts w:ascii="Arial" w:hAnsi="Arial"/>
+                <w:b w:val="0"/>
+                <w:color w:val="171714"/>
+                <w:sz w:val="18"/>
+              </w:rPr>
+              <w:t>只在晚班飞机或另有完整半天时安排；往返江南耗时，且建筑内部不对公众开放。</w:t>
             </w:r>
           </w:p>
         </w:tc>
@@ -1771,7 +2017,7 @@
           <w:color w:val="171714"/>
           <w:sz w:val="21"/>
         </w:rPr>
-        <w:t xml:space="preserve">adidas Gangnam Brand Center - </w:t>
+        <w:t xml:space="preserve">OLENS Gangnam City - </w:t>
       </w:r>
       <w:r>
         <w:rPr>
@@ -1780,7 +2026,7 @@
           <w:color w:val="171714"/>
           <w:sz w:val="21"/>
         </w:rPr>
-        <w:t xml:space="preserve">470 Gangnam-daero, Gangnam-gu, Seoul. </w:t>
+        <w:t xml:space="preserve">428 Gangnam-daero, Gangnam-gu, Seoul. </w:t>
       </w:r>
       <w:hyperlink r:id="rId10">
         <w:r>
@@ -1803,7 +2049,7 @@
           <w:color w:val="171714"/>
           <w:sz w:val="21"/>
         </w:rPr>
-        <w:t xml:space="preserve">CASA LOEWE Seoul - </w:t>
+        <w:t xml:space="preserve">lululemon Gangnam Flagship - </w:t>
       </w:r>
       <w:r>
         <w:rPr>
@@ -1812,7 +2058,7 @@
           <w:color w:val="171714"/>
           <w:sz w:val="21"/>
         </w:rPr>
-        <w:t xml:space="preserve">446 Apgujeong-ro, Gangnam-gu, Seoul. </w:t>
+        <w:t xml:space="preserve">458 Gangnam-daero, Gangnam-gu, Seoul. </w:t>
       </w:r>
       <w:hyperlink r:id="rId11">
         <w:r>
@@ -1835,7 +2081,7 @@
           <w:color w:val="171714"/>
           <w:sz w:val="21"/>
         </w:rPr>
-        <w:t xml:space="preserve">Vivienne Westwood - Galleria Apgujeong - </w:t>
+        <w:t xml:space="preserve">adidas Gangnam Brand Center - </w:t>
       </w:r>
       <w:r>
         <w:rPr>
@@ -1844,7 +2090,7 @@
           <w:color w:val="171714"/>
           <w:sz w:val="21"/>
         </w:rPr>
-        <w:t xml:space="preserve">Galleria WEST 3F, 343 Apgujeong-ro, Gangnam-gu, Seoul. </w:t>
+        <w:t xml:space="preserve">470 Gangnam-daero, Gangnam-gu, Seoul. </w:t>
       </w:r>
       <w:hyperlink r:id="rId12">
         <w:r>
@@ -2026,8 +2272,92 @@
         </w:r>
       </w:hyperlink>
     </w:p>
+    <w:p>
+      <w:pPr>
+        <w:pStyle w:val="ListBullet"/>
+      </w:pPr>
+      <w:hyperlink r:id="rId24">
+        <w:r>
+          <w:rPr>
+            <w:color w:val="365899"/>
+            <w:u w:val="single"/>
+          </w:rPr>
+          <w:t>OLENS Gangnam City</w:t>
+        </w:r>
+      </w:hyperlink>
+    </w:p>
+    <w:p>
+      <w:pPr>
+        <w:pStyle w:val="ListBullet"/>
+      </w:pPr>
+      <w:hyperlink r:id="rId25">
+        <w:r>
+          <w:rPr>
+            <w:color w:val="365899"/>
+            <w:u w:val="single"/>
+          </w:rPr>
+          <w:t>Gentle Monster HAUS DOSAN</w:t>
+        </w:r>
+      </w:hyperlink>
+    </w:p>
+    <w:p>
+      <w:pPr>
+        <w:pStyle w:val="ListBullet"/>
+      </w:pPr>
+      <w:hyperlink r:id="rId26">
+        <w:r>
+          <w:rPr>
+            <w:color w:val="365899"/>
+            <w:u w:val="single"/>
+          </w:rPr>
+          <w:t>Le Labo Garosu-gil</w:t>
+        </w:r>
+      </w:hyperlink>
+    </w:p>
+    <w:p>
+      <w:pPr>
+        <w:pStyle w:val="ListBullet"/>
+      </w:pPr>
+      <w:hyperlink r:id="rId27">
+        <w:r>
+          <w:rPr>
+            <w:color w:val="365899"/>
+            <w:u w:val="single"/>
+          </w:rPr>
+          <w:t>lululemon Gangnam flagship</w:t>
+        </w:r>
+      </w:hyperlink>
+    </w:p>
+    <w:p>
+      <w:pPr>
+        <w:pStyle w:val="ListBullet"/>
+      </w:pPr>
+      <w:hyperlink r:id="rId28">
+        <w:r>
+          <w:rPr>
+            <w:color w:val="365899"/>
+            <w:u w:val="single"/>
+          </w:rPr>
+          <w:t>시현하다 Gangnam Original</w:t>
+        </w:r>
+      </w:hyperlink>
+    </w:p>
+    <w:p>
+      <w:pPr>
+        <w:pStyle w:val="ListBullet"/>
+      </w:pPr>
+      <w:hyperlink r:id="rId29">
+        <w:r>
+          <w:rPr>
+            <w:color w:val="365899"/>
+            <w:u w:val="single"/>
+          </w:rPr>
+          <w:t>T1 HQ Shop</w:t>
+        </w:r>
+      </w:hyperlink>
+    </w:p>
     <w:sectPr>
-      <w:footerReference w:type="default" r:id="rId24"/>
+      <w:footerReference w:type="default" r:id="rId30"/>
       <w:pgSz w:w="12240" w:h="15840"/>
       <w:pgMar w:top="1037" w:right="1123" w:bottom="1037" w:left="1123" w:header="504" w:footer="504" w:gutter="0"/>
       <w:cols w:space="720"/>

</xml_diff>

<commit_message>
Set Korea University stay and August trip dates
</commit_message>
<xml_diff>
--- a/seoul_gangnam_2_night_itinerary.docx
+++ b/seoul_gangnam_2_night_itinerary.docx
@@ -13,7 +13,7 @@
           <w:color w:val="171714"/>
           <w:sz w:val="56"/>
         </w:rPr>
-        <w:t>首尔江南 48 小时行程</w:t>
+        <w:t>首尔 48 小时行程 · 2026年8月1–3日</w:t>
       </w:r>
     </w:p>
     <w:p>
@@ -27,7 +27,7 @@
           <w:color w:val="6E6A61"/>
           <w:sz w:val="22"/>
         </w:rPr>
-        <w:t>两晚首尔路线：落地剪发、妆造证件照、购物与皮肤管理</w:t>
+        <w:t>住宿高丽大：落地剪发、妆造证件照、江南购物与皮肤管理</w:t>
       </w:r>
     </w:p>
     <w:tbl>
@@ -62,7 +62,7 @@
                 <w:color w:val="171714"/>
                 <w:sz w:val="22"/>
               </w:rPr>
-              <w:t>最佳路线：第 1 天落地后先去明洞剪发，再入住江南；第 2 天完成 JOY187 妆造和 시현하다 证件照；第 3 天做皮肤管理并去 T1 粉丝店。</w:t>
+              <w:t>最佳路线：8 月 1 日先到高丽大住宿放行李，再去明洞剪发和江南购物；8 月 2 日完成 JOY187 妆造与证件照；8 月 3 日皮肤管理、T1 后返回住宿取行李并搭 6102 去机场。</w:t>
             </w:r>
           </w:p>
         </w:tc>
@@ -82,7 +82,7 @@
         <w:spacing w:after="80"/>
       </w:pPr>
       <w:r>
-        <w:t>请用准确地址替换地图中的江南酒店临时位置。</w:t>
+        <w:t>住宿地址已设置为 57-8 Goryeodae-ro 11-gil, Seongbuk-gu, Seoul 02850。</w:t>
       </w:r>
     </w:p>
     <w:p>
@@ -116,7 +116,7 @@
         <w:pStyle w:val="Heading2"/>
       </w:pPr>
       <w:r>
-        <w:t>第 1 天: 抵达、剪发 + 江南大路购物</w:t>
+        <w:t>第 1 天 · 8月1日 周六: 抵达、放行李、剪发 + 江南购物</w:t>
       </w:r>
     </w:p>
     <w:tbl>
@@ -253,9 +253,9 @@
                 <w:color w:val="171714"/>
                 <w:sz w:val="18"/>
               </w:rPr>
-              <w:t>机场前往 Parisien Hair</w:t>
+              <w:t>6102 机场巴士前往高丽大</w:t>
               <w:br/>
-              <w:t>明洞</w:t>
+              <w:t>仁川机场 → 高丽大</w:t>
             </w:r>
           </w:p>
         </w:tc>
@@ -281,7 +281,89 @@
                 <w:color w:val="171714"/>
                 <w:sz w:val="18"/>
               </w:rPr>
-              <w:t>入境和取行李后前往明洞。只有航班能在预约前留下至少 2.5-3 小时缓冲时才锁定当天剪发。</w:t>
+              <w:t>入境取行李后搭 6102，在最接近住宿的高丽大站点下车，再步行或短程出租车到住宿。</w:t>
+            </w:r>
+          </w:p>
+        </w:tc>
+      </w:tr>
+      <w:tr>
+        <w:tc>
+          <w:tcPr>
+            <w:tcW w:type="dxa" w:w="1181"/>
+            <w:vAlign w:val="center"/>
+            <w:tcMar>
+              <w:top w:w="100" w:type="dxa"/>
+              <w:start w:w="120" w:type="dxa"/>
+              <w:bottom w:w="100" w:type="dxa"/>
+              <w:end w:w="120" w:type="dxa"/>
+            </w:tcMar>
+          </w:tcPr>
+          <w:p>
+            <w:pPr>
+              <w:spacing w:after="0"/>
+            </w:pPr>
+            <w:r>
+              <w:rPr>
+                <w:rFonts w:ascii="Arial" w:hAnsi="Arial"/>
+                <w:b/>
+                <w:color w:val="171714"/>
+                <w:sz w:val="18"/>
+              </w:rPr>
+              <w:t>先做</w:t>
+            </w:r>
+          </w:p>
+        </w:tc>
+        <w:tc>
+          <w:tcPr>
+            <w:tcW w:type="dxa" w:w="3096"/>
+            <w:vAlign w:val="center"/>
+            <w:tcMar>
+              <w:top w:w="100" w:type="dxa"/>
+              <w:start w:w="120" w:type="dxa"/>
+              <w:bottom w:w="100" w:type="dxa"/>
+              <w:end w:w="120" w:type="dxa"/>
+            </w:tcMar>
+          </w:tcPr>
+          <w:p>
+            <w:pPr>
+              <w:spacing w:after="0"/>
+            </w:pPr>
+            <w:r>
+              <w:rPr>
+                <w:rFonts w:ascii="Arial" w:hAnsi="Arial"/>
+                <w:b w:val="0"/>
+                <w:color w:val="171714"/>
+                <w:sz w:val="18"/>
+              </w:rPr>
+              <w:t>住宿放行李 / 办理入住</w:t>
+              <w:br/>
+              <w:t>57-8 Goryeodae-ro 11-gil</w:t>
+            </w:r>
+          </w:p>
+        </w:tc>
+        <w:tc>
+          <w:tcPr>
+            <w:tcW w:type="dxa" w:w="5544"/>
+            <w:vAlign w:val="center"/>
+            <w:tcMar>
+              <w:top w:w="100" w:type="dxa"/>
+              <w:start w:w="120" w:type="dxa"/>
+              <w:bottom w:w="100" w:type="dxa"/>
+              <w:end w:w="120" w:type="dxa"/>
+            </w:tcMar>
+          </w:tcPr>
+          <w:p>
+            <w:pPr>
+              <w:spacing w:after="0"/>
+            </w:pPr>
+            <w:r>
+              <w:rPr>
+                <w:rFonts w:ascii="Arial" w:hAnsi="Arial"/>
+                <w:b w:val="0"/>
+                <w:color w:val="171714"/>
+                <w:sz w:val="18"/>
+              </w:rPr>
+              <w:t>不要拖着行李去发廊。若未到入住时间，请先确认可寄存行李。</w:t>
             </w:r>
           </w:p>
         </w:tc>
@@ -363,89 +445,7 @@
                 <w:color w:val="171714"/>
                 <w:sz w:val="18"/>
               </w:rPr>
-              <w:t>预留 90-120 分钟。只剪发或简单造型最稳妥，不建议抵达日安排耗时烫染。</w:t>
-            </w:r>
-          </w:p>
-        </w:tc>
-      </w:tr>
-      <w:tr>
-        <w:tc>
-          <w:tcPr>
-            <w:tcW w:type="dxa" w:w="1181"/>
-            <w:vAlign w:val="center"/>
-            <w:tcMar>
-              <w:top w:w="100" w:type="dxa"/>
-              <w:start w:w="120" w:type="dxa"/>
-              <w:bottom w:w="100" w:type="dxa"/>
-              <w:end w:w="120" w:type="dxa"/>
-            </w:tcMar>
-          </w:tcPr>
-          <w:p>
-            <w:pPr>
-              <w:spacing w:after="0"/>
-            </w:pPr>
-            <w:r>
-              <w:rPr>
-                <w:rFonts w:ascii="Arial" w:hAnsi="Arial"/>
-                <w:b/>
-                <w:color w:val="171714"/>
-                <w:sz w:val="18"/>
-              </w:rPr>
-              <w:t>之后</w:t>
-            </w:r>
-          </w:p>
-        </w:tc>
-        <w:tc>
-          <w:tcPr>
-            <w:tcW w:type="dxa" w:w="3096"/>
-            <w:vAlign w:val="center"/>
-            <w:tcMar>
-              <w:top w:w="100" w:type="dxa"/>
-              <w:start w:w="120" w:type="dxa"/>
-              <w:bottom w:w="100" w:type="dxa"/>
-              <w:end w:w="120" w:type="dxa"/>
-            </w:tcMar>
-          </w:tcPr>
-          <w:p>
-            <w:pPr>
-              <w:spacing w:after="0"/>
-            </w:pPr>
-            <w:r>
-              <w:rPr>
-                <w:rFonts w:ascii="Arial" w:hAnsi="Arial"/>
-                <w:b w:val="0"/>
-                <w:color w:val="171714"/>
-                <w:sz w:val="18"/>
-              </w:rPr>
-              <w:t>前往江南酒店并入住</w:t>
-              <w:br/>
-              <w:t>江南</w:t>
-            </w:r>
-          </w:p>
-        </w:tc>
-        <w:tc>
-          <w:tcPr>
-            <w:tcW w:type="dxa" w:w="5544"/>
-            <w:vAlign w:val="center"/>
-            <w:tcMar>
-              <w:top w:w="100" w:type="dxa"/>
-              <w:start w:w="120" w:type="dxa"/>
-              <w:bottom w:w="100" w:type="dxa"/>
-              <w:end w:w="120" w:type="dxa"/>
-            </w:tcMar>
-          </w:tcPr>
-          <w:p>
-            <w:pPr>
-              <w:spacing w:after="0"/>
-            </w:pPr>
-            <w:r>
-              <w:rPr>
-                <w:rFonts w:ascii="Arial" w:hAnsi="Arial"/>
-                <w:b w:val="0"/>
-                <w:color w:val="171714"/>
-                <w:sz w:val="18"/>
-              </w:rPr>
-              <w:t>明洞到江南带行李建议出租车；晚高峰需预留 45-70 分钟。</w:t>
+              <w:t>从安岩搭 6 号线到三角地换 4 号线至明洞，约 35-45 分钟；带时间压力时直接出租车。预留 90-120 分钟。</w:t>
             </w:r>
           </w:p>
         </w:tc>
@@ -474,6 +474,88 @@
                 <w:sz w:val="18"/>
               </w:rPr>
               <w:t>傍晚</w:t>
+            </w:r>
+          </w:p>
+        </w:tc>
+        <w:tc>
+          <w:tcPr>
+            <w:tcW w:type="dxa" w:w="3096"/>
+            <w:vAlign w:val="center"/>
+            <w:tcMar>
+              <w:top w:w="100" w:type="dxa"/>
+              <w:start w:w="120" w:type="dxa"/>
+              <w:bottom w:w="100" w:type="dxa"/>
+              <w:end w:w="120" w:type="dxa"/>
+            </w:tcMar>
+          </w:tcPr>
+          <w:p>
+            <w:pPr>
+              <w:spacing w:after="0"/>
+            </w:pPr>
+            <w:r>
+              <w:rPr>
+                <w:rFonts w:ascii="Arial" w:hAnsi="Arial"/>
+                <w:b w:val="0"/>
+                <w:color w:val="171714"/>
+                <w:sz w:val="18"/>
+              </w:rPr>
+              <w:t>前往江南大路</w:t>
+              <w:br/>
+              <w:t>明洞 → 江南</w:t>
+            </w:r>
+          </w:p>
+        </w:tc>
+        <w:tc>
+          <w:tcPr>
+            <w:tcW w:type="dxa" w:w="5544"/>
+            <w:vAlign w:val="center"/>
+            <w:tcMar>
+              <w:top w:w="100" w:type="dxa"/>
+              <w:start w:w="120" w:type="dxa"/>
+              <w:bottom w:w="100" w:type="dxa"/>
+              <w:end w:w="120" w:type="dxa"/>
+            </w:tcMar>
+          </w:tcPr>
+          <w:p>
+            <w:pPr>
+              <w:spacing w:after="0"/>
+            </w:pPr>
+            <w:r>
+              <w:rPr>
+                <w:rFonts w:ascii="Arial" w:hAnsi="Arial"/>
+                <w:b w:val="0"/>
+                <w:color w:val="171714"/>
+                <w:sz w:val="18"/>
+              </w:rPr>
+              <w:t>地铁约 40-50 分钟；若剪发结束较晚，优先出租车并接受晚高峰堵车。</w:t>
+            </w:r>
+          </w:p>
+        </w:tc>
+      </w:tr>
+      <w:tr>
+        <w:tc>
+          <w:tcPr>
+            <w:tcW w:type="dxa" w:w="1181"/>
+            <w:vAlign w:val="center"/>
+            <w:tcMar>
+              <w:top w:w="100" w:type="dxa"/>
+              <w:start w:w="120" w:type="dxa"/>
+              <w:bottom w:w="100" w:type="dxa"/>
+              <w:end w:w="120" w:type="dxa"/>
+            </w:tcMar>
+          </w:tcPr>
+          <w:p>
+            <w:pPr>
+              <w:spacing w:after="0"/>
+            </w:pPr>
+            <w:r>
+              <w:rPr>
+                <w:rFonts w:ascii="Arial" w:hAnsi="Arial"/>
+                <w:b/>
+                <w:color w:val="171714"/>
+                <w:sz w:val="18"/>
+              </w:rPr>
+              <w:t>18:00</w:t>
             </w:r>
           </w:p>
         </w:tc>
@@ -555,7 +637,7 @@
                 <w:color w:val="171714"/>
                 <w:sz w:val="18"/>
               </w:rPr>
-              <w:t>晚上</w:t>
+              <w:t>19:30</w:t>
             </w:r>
           </w:p>
         </w:tc>
@@ -637,7 +719,7 @@
                 <w:color w:val="171714"/>
                 <w:sz w:val="18"/>
               </w:rPr>
-              <w:t>20:30</w:t>
+              <w:t>21:00</w:t>
             </w:r>
           </w:p>
         </w:tc>
@@ -663,9 +745,9 @@
                 <w:color w:val="171714"/>
                 <w:sz w:val="18"/>
               </w:rPr>
-              <w:t>江南站附近晚餐</w:t>
+              <w:t>返回高丽大住宿</w:t>
               <w:br/>
-              <w:t>自由安排</w:t>
+              <w:t>江南 → 安岩</w:t>
             </w:r>
           </w:p>
         </w:tc>
@@ -691,7 +773,7 @@
                 <w:color w:val="171714"/>
                 <w:sz w:val="18"/>
               </w:rPr>
-              <w:t>如果航班晚点，购物顺延到第三天下午，不要压缩剪发时间。</w:t>
+              <w:t>地铁 2 号线江南站至新堂换 6 号线，约 50-60 分钟；疲劳时搭出租车。</w:t>
             </w:r>
           </w:p>
         </w:tc>
@@ -707,7 +789,7 @@
         <w:pStyle w:val="Heading2"/>
       </w:pPr>
       <w:r>
-        <w:t>第 2 天: JOY187 妆造、证件照 + 狎鸥亭购物</w:t>
+        <w:t>第 2 天 · 8月2日 周日: JOY187 妆造、证件照 + 狎鸥亭购物</w:t>
       </w:r>
     </w:p>
     <w:tbl>
@@ -818,6 +900,88 @@
                 <w:color w:val="171714"/>
                 <w:sz w:val="18"/>
               </w:rPr>
+              <w:t>08:00</w:t>
+            </w:r>
+          </w:p>
+        </w:tc>
+        <w:tc>
+          <w:tcPr>
+            <w:tcW w:type="dxa" w:w="3096"/>
+            <w:vAlign w:val="center"/>
+            <w:tcMar>
+              <w:top w:w="100" w:type="dxa"/>
+              <w:start w:w="120" w:type="dxa"/>
+              <w:bottom w:w="100" w:type="dxa"/>
+              <w:end w:w="120" w:type="dxa"/>
+            </w:tcMar>
+          </w:tcPr>
+          <w:p>
+            <w:pPr>
+              <w:spacing w:after="0"/>
+            </w:pPr>
+            <w:r>
+              <w:rPr>
+                <w:rFonts w:ascii="Arial" w:hAnsi="Arial"/>
+                <w:b w:val="0"/>
+                <w:color w:val="171714"/>
+                <w:sz w:val="18"/>
+              </w:rPr>
+              <w:t>住宿出发去 JOY187</w:t>
+              <w:br/>
+              <w:t>安岩 → 清潭洞</w:t>
+            </w:r>
+          </w:p>
+        </w:tc>
+        <w:tc>
+          <w:tcPr>
+            <w:tcW w:type="dxa" w:w="5544"/>
+            <w:vAlign w:val="center"/>
+            <w:tcMar>
+              <w:top w:w="100" w:type="dxa"/>
+              <w:start w:w="120" w:type="dxa"/>
+              <w:bottom w:w="100" w:type="dxa"/>
+              <w:end w:w="120" w:type="dxa"/>
+            </w:tcMar>
+          </w:tcPr>
+          <w:p>
+            <w:pPr>
+              <w:spacing w:after="0"/>
+            </w:pPr>
+            <w:r>
+              <w:rPr>
+                <w:rFonts w:ascii="Arial" w:hAnsi="Arial"/>
+                <w:b w:val="0"/>
+                <w:color w:val="171714"/>
+                <w:sz w:val="18"/>
+              </w:rPr>
+              <w:t>周日早上出租车约 30-45 分钟，建议预约前至少提前 50 分钟出发。</w:t>
+            </w:r>
+          </w:p>
+        </w:tc>
+      </w:tr>
+      <w:tr>
+        <w:tc>
+          <w:tcPr>
+            <w:tcW w:type="dxa" w:w="1181"/>
+            <w:vAlign w:val="center"/>
+            <w:tcMar>
+              <w:top w:w="100" w:type="dxa"/>
+              <w:start w:w="120" w:type="dxa"/>
+              <w:bottom w:w="100" w:type="dxa"/>
+              <w:end w:w="120" w:type="dxa"/>
+            </w:tcMar>
+          </w:tcPr>
+          <w:p>
+            <w:pPr>
+              <w:spacing w:after="0"/>
+            </w:pPr>
+            <w:r>
+              <w:rPr>
+                <w:rFonts w:ascii="Arial" w:hAnsi="Arial"/>
+                <w:b/>
+                <w:color w:val="171714"/>
+                <w:sz w:val="18"/>
+              </w:rPr>
               <w:t>09:00</w:t>
             </w:r>
           </w:p>
@@ -872,7 +1036,7 @@
                 <w:color w:val="171714"/>
                 <w:sz w:val="18"/>
               </w:rPr>
-              <w:t>建议预留 2-2.5 小时；提前发送证件照参考和服装领口照片。</w:t>
+              <w:t>建议预留 2-2.5 小时；提前发送证件照参考和服装领口照片，并确认周日预约。</w:t>
             </w:r>
           </w:p>
         </w:tc>
@@ -1418,9 +1582,9 @@
                 <w:color w:val="171714"/>
                 <w:sz w:val="18"/>
               </w:rPr>
-              <w:t>返回江南酒店</w:t>
+              <w:t>返回高丽大住宿</w:t>
               <w:br/>
-              <w:t>江南</w:t>
+              <w:t>狎鸥亭 / 新沙 → 安岩</w:t>
             </w:r>
           </w:p>
         </w:tc>
@@ -1446,7 +1610,7 @@
                 <w:color w:val="171714"/>
                 <w:sz w:val="18"/>
               </w:rPr>
-              <w:t>保留卸妆、休息和第二天皮肤管理前的护肤缓冲。</w:t>
+              <w:t>地铁约 45-60 分钟；保留卸妆、休息和第二天皮肤管理前的护肤缓冲。</w:t>
             </w:r>
           </w:p>
         </w:tc>
@@ -1462,7 +1626,7 @@
         <w:pStyle w:val="Heading2"/>
       </w:pPr>
       <w:r>
-        <w:t>第 3 天: 皮肤管理 + 轻松收尾</w:t>
+        <w:t>第 3 天 · 8月3日 周一: 皮肤管理、T1 + 返程</w:t>
       </w:r>
     </w:p>
     <w:tbl>
@@ -1546,6 +1710,170 @@
                 <w:sz w:val="19"/>
               </w:rPr>
               <w:t>安排</w:t>
+            </w:r>
+          </w:p>
+        </w:tc>
+      </w:tr>
+      <w:tr>
+        <w:tc>
+          <w:tcPr>
+            <w:tcW w:type="dxa" w:w="1181"/>
+            <w:vAlign w:val="center"/>
+            <w:tcMar>
+              <w:top w:w="100" w:type="dxa"/>
+              <w:start w:w="120" w:type="dxa"/>
+              <w:bottom w:w="100" w:type="dxa"/>
+              <w:end w:w="120" w:type="dxa"/>
+            </w:tcMar>
+          </w:tcPr>
+          <w:p>
+            <w:pPr>
+              <w:spacing w:after="0"/>
+            </w:pPr>
+            <w:r>
+              <w:rPr>
+                <w:rFonts w:ascii="Arial" w:hAnsi="Arial"/>
+                <w:b/>
+                <w:color w:val="171714"/>
+                <w:sz w:val="18"/>
+              </w:rPr>
+              <w:t>出门前</w:t>
+            </w:r>
+          </w:p>
+        </w:tc>
+        <w:tc>
+          <w:tcPr>
+            <w:tcW w:type="dxa" w:w="3096"/>
+            <w:vAlign w:val="center"/>
+            <w:tcMar>
+              <w:top w:w="100" w:type="dxa"/>
+              <w:start w:w="120" w:type="dxa"/>
+              <w:bottom w:w="100" w:type="dxa"/>
+              <w:end w:w="120" w:type="dxa"/>
+            </w:tcMar>
+          </w:tcPr>
+          <w:p>
+            <w:pPr>
+              <w:spacing w:after="0"/>
+            </w:pPr>
+            <w:r>
+              <w:rPr>
+                <w:rFonts w:ascii="Arial" w:hAnsi="Arial"/>
+                <w:b w:val="0"/>
+                <w:color w:val="171714"/>
+                <w:sz w:val="18"/>
+              </w:rPr>
+              <w:t>退房并寄存行李</w:t>
+              <w:br/>
+              <w:t>高丽大住宿</w:t>
+            </w:r>
+          </w:p>
+        </w:tc>
+        <w:tc>
+          <w:tcPr>
+            <w:tcW w:type="dxa" w:w="5544"/>
+            <w:vAlign w:val="center"/>
+            <w:tcMar>
+              <w:top w:w="100" w:type="dxa"/>
+              <w:start w:w="120" w:type="dxa"/>
+              <w:bottom w:w="100" w:type="dxa"/>
+              <w:end w:w="120" w:type="dxa"/>
+            </w:tcMar>
+          </w:tcPr>
+          <w:p>
+            <w:pPr>
+              <w:spacing w:after="0"/>
+            </w:pPr>
+            <w:r>
+              <w:rPr>
+                <w:rFonts w:ascii="Arial" w:hAnsi="Arial"/>
+                <w:b w:val="0"/>
+                <w:color w:val="171714"/>
+                <w:sz w:val="18"/>
+              </w:rPr>
+              <w:t>先向住宿确认周一可寄存到几点；护照、退税单和随身物品带好。</w:t>
+            </w:r>
+          </w:p>
+        </w:tc>
+      </w:tr>
+      <w:tr>
+        <w:tc>
+          <w:tcPr>
+            <w:tcW w:type="dxa" w:w="1181"/>
+            <w:vAlign w:val="center"/>
+            <w:tcMar>
+              <w:top w:w="100" w:type="dxa"/>
+              <w:start w:w="120" w:type="dxa"/>
+              <w:bottom w:w="100" w:type="dxa"/>
+              <w:end w:w="120" w:type="dxa"/>
+            </w:tcMar>
+          </w:tcPr>
+          <w:p>
+            <w:pPr>
+              <w:spacing w:after="0"/>
+            </w:pPr>
+            <w:r>
+              <w:rPr>
+                <w:rFonts w:ascii="Arial" w:hAnsi="Arial"/>
+                <w:b/>
+                <w:color w:val="171714"/>
+                <w:sz w:val="18"/>
+              </w:rPr>
+              <w:t>08:45</w:t>
+            </w:r>
+          </w:p>
+        </w:tc>
+        <w:tc>
+          <w:tcPr>
+            <w:tcW w:type="dxa" w:w="3096"/>
+            <w:vAlign w:val="center"/>
+            <w:tcMar>
+              <w:top w:w="100" w:type="dxa"/>
+              <w:start w:w="120" w:type="dxa"/>
+              <w:bottom w:w="100" w:type="dxa"/>
+              <w:end w:w="120" w:type="dxa"/>
+            </w:tcMar>
+          </w:tcPr>
+          <w:p>
+            <w:pPr>
+              <w:spacing w:after="0"/>
+            </w:pPr>
+            <w:r>
+              <w:rPr>
+                <w:rFonts w:ascii="Arial" w:hAnsi="Arial"/>
+                <w:b w:val="0"/>
+                <w:color w:val="171714"/>
+                <w:sz w:val="18"/>
+              </w:rPr>
+              <w:t>前往林克医院</w:t>
+              <w:br/>
+              <w:t>安岩 → 新论岘</w:t>
+            </w:r>
+          </w:p>
+        </w:tc>
+        <w:tc>
+          <w:tcPr>
+            <w:tcW w:type="dxa" w:w="5544"/>
+            <w:vAlign w:val="center"/>
+            <w:tcMar>
+              <w:top w:w="100" w:type="dxa"/>
+              <w:start w:w="120" w:type="dxa"/>
+              <w:bottom w:w="100" w:type="dxa"/>
+              <w:end w:w="120" w:type="dxa"/>
+            </w:tcMar>
+          </w:tcPr>
+          <w:p>
+            <w:pPr>
+              <w:spacing w:after="0"/>
+            </w:pPr>
+            <w:r>
+              <w:rPr>
+                <w:rFonts w:ascii="Arial" w:hAnsi="Arial"/>
+                <w:b w:val="0"/>
+                <w:color w:val="171714"/>
+                <w:sz w:val="18"/>
+              </w:rPr>
+              <w:t>地铁约 50-60 分钟；为 10:00 报到建议 08:45 左右出发。</w:t>
             </w:r>
           </w:p>
         </w:tc>
@@ -1845,9 +2173,9 @@
                 <w:color w:val="171714"/>
                 <w:sz w:val="18"/>
               </w:rPr>
-              <w:t>补买遗漏物品 / 返回酒店</w:t>
+              <w:t>返回高丽大取行李</w:t>
               <w:br/>
-              <w:t>江南</w:t>
+              <w:t>江南 → 安岩</w:t>
             </w:r>
           </w:p>
         </w:tc>
@@ -1873,7 +2201,7 @@
                 <w:color w:val="171714"/>
                 <w:sz w:val="18"/>
               </w:rPr>
-              <w:t>若皮肤没有明显红肿，可在医生允许下进行轻松室内活动。</w:t>
+              <w:t>若皮肤没有明显红肿，可在医生允许下进行轻松室内活动；返程交通至少预留 60 分钟。</w:t>
             </w:r>
           </w:p>
         </w:tc>
@@ -1901,7 +2229,7 @@
                 <w:color w:val="171714"/>
                 <w:sz w:val="18"/>
               </w:rPr>
-              <w:t>可选</w:t>
+              <w:t>返机场</w:t>
             </w:r>
           </w:p>
         </w:tc>
@@ -1927,7 +2255,89 @@
                 <w:color w:val="171714"/>
                 <w:sz w:val="18"/>
               </w:rPr>
-              <w:t>HYBE 总部外观打卡</w:t>
+              <w:t>6102 机场巴士</w:t>
+              <w:br/>
+              <w:t>高丽大 → 仁川机场</w:t>
+            </w:r>
+          </w:p>
+        </w:tc>
+        <w:tc>
+          <w:tcPr>
+            <w:tcW w:type="dxa" w:w="5544"/>
+            <w:vAlign w:val="center"/>
+            <w:tcMar>
+              <w:top w:w="100" w:type="dxa"/>
+              <w:start w:w="120" w:type="dxa"/>
+              <w:bottom w:w="100" w:type="dxa"/>
+              <w:end w:w="120" w:type="dxa"/>
+            </w:tcMar>
+          </w:tcPr>
+          <w:p>
+            <w:pPr>
+              <w:spacing w:after="0"/>
+            </w:pPr>
+            <w:r>
+              <w:rPr>
+                <w:rFonts w:ascii="Arial" w:hAnsi="Arial"/>
+                <w:b w:val="0"/>
+                <w:color w:val="171714"/>
+                <w:sz w:val="18"/>
+              </w:rPr>
+              <w:t>国际航班建议在起飞前至少 4.5-5 小时从住宿附近出发。</w:t>
+            </w:r>
+          </w:p>
+        </w:tc>
+      </w:tr>
+      <w:tr>
+        <w:tc>
+          <w:tcPr>
+            <w:tcW w:type="dxa" w:w="1181"/>
+            <w:vAlign w:val="center"/>
+            <w:tcMar>
+              <w:top w:w="100" w:type="dxa"/>
+              <w:start w:w="120" w:type="dxa"/>
+              <w:bottom w:w="100" w:type="dxa"/>
+              <w:end w:w="120" w:type="dxa"/>
+            </w:tcMar>
+          </w:tcPr>
+          <w:p>
+            <w:pPr>
+              <w:spacing w:after="0"/>
+            </w:pPr>
+            <w:r>
+              <w:rPr>
+                <w:rFonts w:ascii="Arial" w:hAnsi="Arial"/>
+                <w:b/>
+                <w:color w:val="171714"/>
+                <w:sz w:val="18"/>
+              </w:rPr>
+              <w:t>取消</w:t>
+            </w:r>
+          </w:p>
+        </w:tc>
+        <w:tc>
+          <w:tcPr>
+            <w:tcW w:type="dxa" w:w="3096"/>
+            <w:vAlign w:val="center"/>
+            <w:tcMar>
+              <w:top w:w="100" w:type="dxa"/>
+              <w:start w:w="120" w:type="dxa"/>
+              <w:bottom w:w="100" w:type="dxa"/>
+              <w:end w:w="120" w:type="dxa"/>
+            </w:tcMar>
+          </w:tcPr>
+          <w:p>
+            <w:pPr>
+              <w:spacing w:after="0"/>
+            </w:pPr>
+            <w:r>
+              <w:rPr>
+                <w:rFonts w:ascii="Arial" w:hAnsi="Arial"/>
+                <w:b w:val="0"/>
+                <w:color w:val="171714"/>
+                <w:sz w:val="18"/>
+              </w:rPr>
+              <w:t>HYBE 总部支线</w:t>
               <w:br/>
               <w:t>龙山</w:t>
             </w:r>
@@ -1955,7 +2365,7 @@
                 <w:color w:val="171714"/>
                 <w:sz w:val="18"/>
               </w:rPr>
-              <w:t>只在晚班飞机或另有完整半天时安排；往返江南耗时，且建筑内部不对公众开放。</w:t>
+              <w:t>三天行程已跨城多次，且周一需皮肤管理与返机场；除非航班很晚，否则不建议加入。</w:t>
             </w:r>
           </w:p>
         </w:tc>
@@ -2112,7 +2522,7 @@
     </w:p>
     <w:p>
       <w:r>
-        <w:t>商店位置及公布的营业时间核对于 2026 年 6 月，请在出发前再次确认。</w:t>
+        <w:t>行程日期为 2026 年 8 月 1–3 日。商店位置及公布的营业时间核对于 2026 年 6 月，请在出发前再次确认。</w:t>
       </w:r>
       <w:r>
         <w:t>小红书网页版搜索需要登录，因此无法独立查看具体笔记内容。</w:t>
@@ -2226,7 +2636,7 @@
             <w:color w:val="365899"/>
             <w:u w:val="single"/>
           </w:rPr>
-          <w:t>首尔市机场交通指南</w:t>
+          <w:t>6102 高丽大机场巴士</w:t>
         </w:r>
       </w:hyperlink>
     </w:p>
@@ -2240,7 +2650,7 @@
             <w:color w:val="365899"/>
             <w:u w:val="single"/>
           </w:rPr>
-          <w:t>首尔公共交通指南</w:t>
+          <w:t>首尔市机场交通指南</w:t>
         </w:r>
       </w:hyperlink>
     </w:p>
@@ -2254,7 +2664,7 @@
             <w:color w:val="365899"/>
             <w:u w:val="single"/>
           </w:rPr>
-          <w:t>气候同行卡短期票</w:t>
+          <w:t>首尔公共交通指南</w:t>
         </w:r>
       </w:hyperlink>
     </w:p>
@@ -2268,7 +2678,7 @@
             <w:color w:val="365899"/>
             <w:u w:val="single"/>
           </w:rPr>
-          <w:t>韩国购物退税官方指南</w:t>
+          <w:t>气候同行卡短期票</w:t>
         </w:r>
       </w:hyperlink>
     </w:p>
@@ -2282,7 +2692,7 @@
             <w:color w:val="365899"/>
             <w:u w:val="single"/>
           </w:rPr>
-          <w:t>OLENS Gangnam City</w:t>
+          <w:t>韩国购物退税官方指南</w:t>
         </w:r>
       </w:hyperlink>
     </w:p>
@@ -2296,7 +2706,7 @@
             <w:color w:val="365899"/>
             <w:u w:val="single"/>
           </w:rPr>
-          <w:t>Gentle Monster HAUS DOSAN</w:t>
+          <w:t>OLENS Gangnam City</w:t>
         </w:r>
       </w:hyperlink>
     </w:p>
@@ -2310,7 +2720,7 @@
             <w:color w:val="365899"/>
             <w:u w:val="single"/>
           </w:rPr>
-          <w:t>Le Labo Garosu-gil</w:t>
+          <w:t>Gentle Monster HAUS DOSAN</w:t>
         </w:r>
       </w:hyperlink>
     </w:p>
@@ -2324,7 +2734,7 @@
             <w:color w:val="365899"/>
             <w:u w:val="single"/>
           </w:rPr>
-          <w:t>lululemon Gangnam flagship</w:t>
+          <w:t>Le Labo Garosu-gil</w:t>
         </w:r>
       </w:hyperlink>
     </w:p>
@@ -2338,7 +2748,7 @@
             <w:color w:val="365899"/>
             <w:u w:val="single"/>
           </w:rPr>
-          <w:t>시현하다 Gangnam Original</w:t>
+          <w:t>lululemon Gangnam flagship</w:t>
         </w:r>
       </w:hyperlink>
     </w:p>
@@ -2352,12 +2762,26 @@
             <w:color w:val="365899"/>
             <w:u w:val="single"/>
           </w:rPr>
+          <w:t>시현하다 Gangnam Original</w:t>
+        </w:r>
+      </w:hyperlink>
+    </w:p>
+    <w:p>
+      <w:pPr>
+        <w:pStyle w:val="ListBullet"/>
+      </w:pPr>
+      <w:hyperlink r:id="rId30">
+        <w:r>
+          <w:rPr>
+            <w:color w:val="365899"/>
+            <w:u w:val="single"/>
+          </w:rPr>
           <w:t>T1 HQ Shop</w:t>
         </w:r>
       </w:hyperlink>
     </w:p>
     <w:sectPr>
-      <w:footerReference w:type="default" r:id="rId30"/>
+      <w:footerReference w:type="default" r:id="rId31"/>
       <w:pgSz w:w="12240" w:h="15840"/>
       <w:pgMar w:top="1037" w:right="1123" w:bottom="1037" w:left="1123" w:header="504" w:footer="504" w:gutter="0"/>
       <w:cols w:space="720"/>
@@ -2381,7 +2805,7 @@
         <w:color w:val="6E6A61"/>
         <w:sz w:val="17"/>
       </w:rPr>
-      <w:t>首尔江南两晚行程 | 2026 年 6 月制作</w:t>
+      <w:t>首尔两晚行程 | 2026 年 8 月 1–3 日</w:t>
     </w:r>
   </w:p>
 </w:ftr>

</xml_diff>